<commit_message>
HF-SELAP implementation, experiments and report
Co-Authored-By: Claude Opus 5.5 <noreply@anthropic.com>
</commit_message>
<xml_diff>
--- a/HF-SELAP_Report.docx
+++ b/HF-SELAP_Report.docx
@@ -63,7 +63,7 @@
         <w:t>HF-SELAP</w:t>
       </w:r>
       <w:r>
-        <w:t>, a hierarchical federated extension. HF-SELAP keeps SELAP's four-message exchange unchanged on the radio interface. Behind it, the work is spread over several Regional TAs coordinated by a Root/Federation TA. Around this core it adds load balancing, heartbeat-based fail-over, a federated revocation registry, recovery by re-enrolment and an Ascon-80pq post-quantum mode. The complete system was implemented in Python. That includes a from-scratch ASCON verified against the reference implementation, a simulated arbiter PUF with a code-offset fuzzy extractor, and a discrete-event network simulator. Measured results show 0.383 ms of computation on the vehicle and 1.165 ms on the UAV per authentication, with exactly 2432 bits on the air interface. Under a 70 % hot-spot load of 3000 requests/s, three load-balanced Regional TAs authenticated 100.0 % of requests, against 40.5 % for a single TA. While a Regional TA was down, 91.4 % of requests were still served within one second, against 0.0 % without federation. All 22 implemented attack scenarios were blocked, and the post-quantum mode changed the total computation by only 1.9 %.</w:t>
+        <w:t>, a hierarchical federated extension. HF-SELAP keeps SELAP's four-message exchange unchanged on the radio interface. Behind it, the work is spread over several Regional TAs coordinated by a Root/Federation TA. Around this core it adds load balancing, heartbeat-based fail-over, a federated revocation registry, recovery by re-enrolment and an Ascon-80pq post-quantum mode. The complete system was implemented in Python. That includes a from-scratch ASCON verified against the reference implementation, a simulated arbiter PUF with a code-offset fuzzy extractor, and a discrete-event network simulator. Measured results show 0.326 ms of computation on the vehicle and 0.680 ms on the UAV per authentication, with exactly 2432 bits on the air interface. Under a 70 % hot-spot load of 3000 requests/s, three load-balanced Regional TAs authenticated 100.0 % of requests, against 30.0 % for a single TA. While a Regional TA was down, 91.4 % of requests were still served within one second, against 0.0 % without federation. All 22 implemented attack scenarios were blocked, and the post-quantum mode changed the total computation by only -0.1 %.</w:t>
       </w:r>
     </w:p>
     <w:p>
@@ -5925,7 +5925,7 @@
         <w:rPr>
           <w:sz w:val="19"/>
         </w:rPr>
-        <w:t xml:space="preserve"> Execution time of primitives (2000 runs each)</w:t>
+        <w:t xml:space="preserve"> Execution time of primitives (300 runs each)</w:t>
       </w:r>
     </w:p>
     <w:tbl>
@@ -6054,7 +6054,7 @@
               <w:rPr>
                 <w:sz w:val="18"/>
               </w:rPr>
-              <w:t>0.0007</w:t>
+              <w:t>0.0006</w:t>
             </w:r>
           </w:p>
         </w:tc>
@@ -6071,7 +6071,7 @@
               <w:rPr>
                 <w:sz w:val="18"/>
               </w:rPr>
-              <w:t>0.0027</w:t>
+              <w:t>0.0012</w:t>
             </w:r>
           </w:p>
         </w:tc>
@@ -6088,7 +6088,7 @@
               <w:rPr>
                 <w:sz w:val="18"/>
               </w:rPr>
-              <w:t>0.0006</w:t>
+              <w:t>0.0005</w:t>
             </w:r>
           </w:p>
         </w:tc>
@@ -6124,7 +6124,7 @@
               <w:rPr>
                 <w:sz w:val="18"/>
               </w:rPr>
-              <w:t>0.2734</w:t>
+              <w:t>0.1677</w:t>
             </w:r>
           </w:p>
         </w:tc>
@@ -6141,7 +6141,7 @@
               <w:rPr>
                 <w:sz w:val="18"/>
               </w:rPr>
-              <w:t>0.5631</w:t>
+              <w:t>0.0424</w:t>
             </w:r>
           </w:p>
         </w:tc>
@@ -6158,7 +6158,7 @@
               <w:rPr>
                 <w:sz w:val="18"/>
               </w:rPr>
-              <w:t>0.1724</w:t>
+              <w:t>0.1543</w:t>
             </w:r>
           </w:p>
         </w:tc>
@@ -6194,7 +6194,7 @@
               <w:rPr>
                 <w:sz w:val="18"/>
               </w:rPr>
-              <w:t>0.1880</w:t>
+              <w:t>0.1586</w:t>
             </w:r>
           </w:p>
         </w:tc>
@@ -6211,7 +6211,7 @@
               <w:rPr>
                 <w:sz w:val="18"/>
               </w:rPr>
-              <w:t>0.0773</w:t>
+              <w:t>0.0132</w:t>
             </w:r>
           </w:p>
         </w:tc>
@@ -6228,7 +6228,7 @@
               <w:rPr>
                 <w:sz w:val="18"/>
               </w:rPr>
-              <w:t>0.1704</w:t>
+              <w:t>0.1548</w:t>
             </w:r>
           </w:p>
         </w:tc>
@@ -6264,7 +6264,7 @@
               <w:rPr>
                 <w:sz w:val="18"/>
               </w:rPr>
-              <w:t>0.1849</w:t>
+              <w:t>0.1734</w:t>
             </w:r>
           </w:p>
         </w:tc>
@@ -6281,7 +6281,7 @@
               <w:rPr>
                 <w:sz w:val="18"/>
               </w:rPr>
-              <w:t>0.0726</w:t>
+              <w:t>0.0430</w:t>
             </w:r>
           </w:p>
         </w:tc>
@@ -6298,7 +6298,7 @@
               <w:rPr>
                 <w:sz w:val="18"/>
               </w:rPr>
-              <w:t>0.1663</w:t>
+              <w:t>0.1583</w:t>
             </w:r>
           </w:p>
         </w:tc>
@@ -6334,7 +6334,7 @@
               <w:rPr>
                 <w:sz w:val="18"/>
               </w:rPr>
-              <w:t>0.6349</w:t>
+              <w:t>0.4056</w:t>
             </w:r>
           </w:p>
         </w:tc>
@@ -6351,7 +6351,7 @@
               <w:rPr>
                 <w:sz w:val="18"/>
               </w:rPr>
-              <w:t>0.1554</w:t>
+              <w:t>0.1745</w:t>
             </w:r>
           </w:p>
         </w:tc>
@@ -6368,7 +6368,7 @@
               <w:rPr>
                 <w:sz w:val="18"/>
               </w:rPr>
-              <w:t>0.5893</w:t>
+              <w:t>0.4110</w:t>
             </w:r>
           </w:p>
         </w:tc>
@@ -6404,7 +6404,7 @@
               <w:rPr>
                 <w:sz w:val="18"/>
               </w:rPr>
-              <w:t>0.0109</w:t>
+              <w:t>0.0107</w:t>
             </w:r>
           </w:p>
         </w:tc>
@@ -6421,7 +6421,7 @@
               <w:rPr>
                 <w:sz w:val="18"/>
               </w:rPr>
-              <w:t>0.0096</w:t>
+              <w:t>0.0047</w:t>
             </w:r>
           </w:p>
         </w:tc>
@@ -6438,7 +6438,7 @@
               <w:rPr>
                 <w:sz w:val="18"/>
               </w:rPr>
-              <w:t>0.0100</w:t>
+              <w:t>0.0103</w:t>
             </w:r>
           </w:p>
         </w:tc>
@@ -6474,7 +6474,7 @@
               <w:rPr>
                 <w:sz w:val="18"/>
               </w:rPr>
-              <w:t>0.0149</w:t>
+              <w:t>0.0105</w:t>
             </w:r>
           </w:p>
         </w:tc>
@@ -6491,7 +6491,7 @@
               <w:rPr>
                 <w:sz w:val="18"/>
               </w:rPr>
-              <w:t>0.0192</w:t>
+              <w:t>0.0058</w:t>
             </w:r>
           </w:p>
         </w:tc>
@@ -6508,7 +6508,7 @@
               <w:rPr>
                 <w:sz w:val="18"/>
               </w:rPr>
-              <w:t>0.0111</w:t>
+              <w:t>0.0098</w:t>
             </w:r>
           </w:p>
         </w:tc>
@@ -6524,7 +6524,7 @@
         <w:jc w:val="both"/>
       </w:pPr>
       <w:r>
-        <w:t>SHA-256 runs in native code and costs about 0.0007 ms, while the pure-Python ASCON needs about 0.273 ms to encrypt the largest SELAP payload. ASCON therefore dominates protocol cost in this prototype. A native or hardware ASCON would be one to two orders of magnitude faster, so the absolute numbers below are conservative. Ascon-80pq costs essentially the same as Ascon-128 (0.185 ms): the two variants share the permutation and differ only in key loading. Evaluating the 896-bit PUF response is the most expensive single UAV operation, while the fuzzy extractor itself is very cheap.</w:t>
+        <w:t>SHA-256 runs in native code and costs about 0.0006 ms, while the pure-Python ASCON needs about 0.168 ms to encrypt the largest SELAP payload. ASCON therefore dominates protocol cost in this prototype. A native or hardware ASCON would be one to two orders of magnitude faster, so the absolute numbers below are conservative. Ascon-80pq costs essentially the same as Ascon-128 (0.173 ms): the two variants share the permutation and differ only in key loading. Evaluating the 896-bit PUF response is the most expensive single UAV operation, while the fuzzy extractor itself is very cheap.</w:t>
       </w:r>
     </w:p>
     <w:p>
@@ -6552,7 +6552,7 @@
         <w:rPr>
           <w:sz w:val="19"/>
         </w:rPr>
-        <w:t xml:space="preserve"> Mean computation time per authentication (400 runs, ms)</w:t>
+        <w:t xml:space="preserve"> Mean computation time per authentication (80 runs, ms)</w:t>
       </w:r>
     </w:p>
     <w:tbl>
@@ -6721,7 +6721,7 @@
               <w:rPr>
                 <w:sz w:val="18"/>
               </w:rPr>
-              <w:t>0.388</w:t>
+              <w:t>0.325</w:t>
             </w:r>
           </w:p>
         </w:tc>
@@ -6738,7 +6738,7 @@
               <w:rPr>
                 <w:sz w:val="18"/>
               </w:rPr>
-              <w:t>1.187</w:t>
+              <w:t>0.685</w:t>
             </w:r>
           </w:p>
         </w:tc>
@@ -6755,7 +6755,7 @@
               <w:rPr>
                 <w:sz w:val="18"/>
               </w:rPr>
-              <w:t>0.757</w:t>
+              <w:t>0.629</w:t>
             </w:r>
           </w:p>
         </w:tc>
@@ -6772,7 +6772,7 @@
               <w:rPr>
                 <w:sz w:val="18"/>
               </w:rPr>
-              <w:t>2.332</w:t>
+              <w:t>1.639</w:t>
             </w:r>
           </w:p>
         </w:tc>
@@ -6825,7 +6825,7 @@
               <w:rPr>
                 <w:sz w:val="18"/>
               </w:rPr>
-              <w:t>0.383</w:t>
+              <w:t>0.326</w:t>
             </w:r>
           </w:p>
         </w:tc>
@@ -6842,7 +6842,7 @@
               <w:rPr>
                 <w:sz w:val="18"/>
               </w:rPr>
-              <w:t>1.165</w:t>
+              <w:t>0.680</w:t>
             </w:r>
           </w:p>
         </w:tc>
@@ -6859,7 +6859,7 @@
               <w:rPr>
                 <w:sz w:val="18"/>
               </w:rPr>
-              <w:t>0.750</w:t>
+              <w:t>0.624</w:t>
             </w:r>
           </w:p>
         </w:tc>
@@ -6876,7 +6876,7 @@
               <w:rPr>
                 <w:sz w:val="18"/>
               </w:rPr>
-              <w:t>2.298</w:t>
+              <w:t>1.630</w:t>
             </w:r>
           </w:p>
         </w:tc>
@@ -6893,7 +6893,7 @@
               <w:rPr>
                 <w:sz w:val="18"/>
               </w:rPr>
-              <w:t>0.832</w:t>
+              <w:t>0.709</w:t>
             </w:r>
           </w:p>
         </w:tc>
@@ -6929,7 +6929,7 @@
               <w:rPr>
                 <w:sz w:val="18"/>
               </w:rPr>
-              <w:t>0.388</w:t>
+              <w:t>0.328</w:t>
             </w:r>
           </w:p>
         </w:tc>
@@ -6946,7 +6946,7 @@
               <w:rPr>
                 <w:sz w:val="18"/>
               </w:rPr>
-              <w:t>1.175</w:t>
+              <w:t>0.675</w:t>
             </w:r>
           </w:p>
         </w:tc>
@@ -6963,7 +6963,7 @@
               <w:rPr>
                 <w:sz w:val="18"/>
               </w:rPr>
-              <w:t>0.757</w:t>
+              <w:t>0.630</w:t>
             </w:r>
           </w:p>
         </w:tc>
@@ -6980,7 +6980,7 @@
               <w:rPr>
                 <w:sz w:val="18"/>
               </w:rPr>
-              <w:t>2.320</w:t>
+              <w:t>1.633</w:t>
             </w:r>
           </w:p>
         </w:tc>
@@ -6997,7 +6997,7 @@
               <w:rPr>
                 <w:sz w:val="18"/>
               </w:rPr>
-              <w:t>0.832</w:t>
+              <w:t>0.687</w:t>
             </w:r>
           </w:p>
         </w:tc>
@@ -7033,7 +7033,7 @@
               <w:rPr>
                 <w:sz w:val="18"/>
               </w:rPr>
-              <w:t>0.390</w:t>
+              <w:t>0.323</w:t>
             </w:r>
           </w:p>
         </w:tc>
@@ -7050,7 +7050,7 @@
               <w:rPr>
                 <w:sz w:val="18"/>
               </w:rPr>
-              <w:t>1.191</w:t>
+              <w:t>0.678</w:t>
             </w:r>
           </w:p>
         </w:tc>
@@ -7067,7 +7067,7 @@
               <w:rPr>
                 <w:sz w:val="18"/>
               </w:rPr>
-              <w:t>0.759</w:t>
+              <w:t>0.627</w:t>
             </w:r>
           </w:p>
         </w:tc>
@@ -7084,7 +7084,7 @@
               <w:rPr>
                 <w:sz w:val="18"/>
               </w:rPr>
-              <w:t>2.340</w:t>
+              <w:t>1.628</w:t>
             </w:r>
           </w:p>
         </w:tc>
@@ -7101,7 +7101,7 @@
               <w:rPr>
                 <w:sz w:val="18"/>
               </w:rPr>
-              <w:t>0.866</w:t>
+              <w:t>0.697</w:t>
             </w:r>
           </w:p>
         </w:tc>
@@ -7759,7 +7759,7 @@
         <w:jc w:val="both"/>
       </w:pPr>
       <w:r>
-        <w:t>The operation counts match the SELAP cost model exactly, which confirms that the implementation follows the protocol. The federation adds nothing to the vehicle or the UAV. On the authentication path the serving TA also costs the same: 0.750 ms for HF-SELAP against 0.757 ms for single-TA SELAP, a difference within run-to-run variation. In a cross-region run the TA performs one hash fewer, because the delegated record already contains PID</w:t>
+        <w:t>The operation counts match the SELAP cost model exactly, which confirms that the implementation follows the protocol. The federation adds nothing to the vehicle or the UAV. On the authentication path the serving TA also costs the same: 0.624 ms for HF-SELAP against 0.629 ms for single-TA SELAP, a difference within run-to-run variation. In a cross-region run the TA performs one hash fewer, because the delegated record already contains PID</w:t>
       </w:r>
       <w:r>
         <w:rPr>
@@ -7768,7 +7768,7 @@
         <w:t>U</w:t>
       </w:r>
       <w:r>
-        <w:t>, but the saving is too small to measure. The extra work HF-SELAP introduces is the asynchronous identity write-through, about 0.832 ms of combined RTA and Root TA time. It runs after Msg4 has been sent, so it does not delay the vehicle. The first cross-region request to a given UAV also pays a one-time credential fetch: 1.803 ms at the TA against 0.757 ms once cached. The post-quantum mode changed the total by 1.9 %, in line with the small difference between the two ASCON variants in Table 5.</w:t>
+        <w:t>, but the saving is too small to measure. The extra work HF-SELAP introduces is the asynchronous identity write-through, about 0.709 ms of combined RTA and Root TA time. It runs after Msg4 has been sent, so it does not delay the vehicle. The first cross-region request to a given UAV also pays a one-time credential fetch: 1.601 ms at the TA against 0.630 ms once cached. The post-quantum mode changed the total by -0.1 %, in line with the small difference between the two ASCON variants in Table 5.</w:t>
       </w:r>
     </w:p>
     <w:p>
@@ -7776,7 +7776,7 @@
         <w:jc w:val="both"/>
       </w:pPr>
       <w:r>
-        <w:t>With the 7.029 W power model, one authentication costs about 2.69 mJ on the vehicle and 8.19 mJ on the UAV (estimate). Even with an unoptimised Python ASCON, a UAV battery of a few tens of watt-hours could fund millions of authentications, so security does not limit flight time.</w:t>
+        <w:t>With the 7.029 W power model, one authentication costs about 2.29 mJ on the vehicle and 4.78 mJ on the UAV (estimate). Even with an unoptimised Python ASCON, a UAV battery of a few tens of watt-hours could fund millions of authentications, so security does not limit flight time.</w:t>
       </w:r>
     </w:p>
     <w:p>
@@ -9139,7 +9139,7 @@
               <w:rPr>
                 <w:sz w:val="18"/>
               </w:rPr>
-              <w:t>40.5</w:t>
+              <w:t>30.0</w:t>
             </w:r>
           </w:p>
         </w:tc>
@@ -9156,7 +9156,7 @@
               <w:rPr>
                 <w:sz w:val="18"/>
               </w:rPr>
-              <w:t>264.4</w:t>
+              <w:t>335.3</w:t>
             </w:r>
           </w:p>
         </w:tc>
@@ -9173,7 +9173,7 @@
               <w:rPr>
                 <w:sz w:val="18"/>
               </w:rPr>
-              <w:t>327.0</w:t>
+              <w:t>402.5</w:t>
             </w:r>
           </w:p>
         </w:tc>
@@ -9226,7 +9226,7 @@
               <w:rPr>
                 <w:sz w:val="18"/>
               </w:rPr>
-              <w:t>1500</w:t>
+              <w:t>1000</w:t>
             </w:r>
           </w:p>
         </w:tc>
@@ -9243,7 +9243,7 @@
               <w:rPr>
                 <w:sz w:val="18"/>
               </w:rPr>
-              <w:t>74.5</w:t>
+              <w:t>82.7</w:t>
             </w:r>
           </w:p>
         </w:tc>
@@ -9260,7 +9260,7 @@
               <w:rPr>
                 <w:sz w:val="18"/>
               </w:rPr>
-              <w:t>162.4</w:t>
+              <w:t>147.0</w:t>
             </w:r>
           </w:p>
         </w:tc>
@@ -9277,7 +9277,7 @@
               <w:rPr>
                 <w:sz w:val="18"/>
               </w:rPr>
-              <w:t>366.5</w:t>
+              <w:t>269.3</w:t>
             </w:r>
           </w:p>
         </w:tc>
@@ -9294,7 +9294,7 @@
               <w:rPr>
                 <w:sz w:val="18"/>
               </w:rPr>
-              <w:t>0.853</w:t>
+              <w:t>0.763</w:t>
             </w:r>
           </w:p>
         </w:tc>
@@ -9330,7 +9330,7 @@
               <w:rPr>
                 <w:sz w:val="18"/>
               </w:rPr>
-              <w:t>2000</w:t>
+              <w:t>≥ 3000</w:t>
             </w:r>
           </w:p>
         </w:tc>
@@ -9347,7 +9347,7 @@
               <w:rPr>
                 <w:sz w:val="18"/>
               </w:rPr>
-              <w:t>89.2</w:t>
+              <w:t>99.5</w:t>
             </w:r>
           </w:p>
         </w:tc>
@@ -9364,7 +9364,7 @@
               <w:rPr>
                 <w:sz w:val="18"/>
               </w:rPr>
-              <w:t>237.4</w:t>
+              <w:t>160.0</w:t>
             </w:r>
           </w:p>
         </w:tc>
@@ -9381,7 +9381,7 @@
               <w:rPr>
                 <w:sz w:val="18"/>
               </w:rPr>
-              <w:t>426.6</w:t>
+              <w:t>281.8</w:t>
             </w:r>
           </w:p>
         </w:tc>
@@ -9468,7 +9468,7 @@
               <w:rPr>
                 <w:sz w:val="18"/>
               </w:rPr>
-              <w:t>201.8</w:t>
+              <w:t>107.7</w:t>
             </w:r>
           </w:p>
         </w:tc>
@@ -9485,7 +9485,7 @@
               <w:rPr>
                 <w:sz w:val="18"/>
               </w:rPr>
-              <w:t>310.1</w:t>
+              <w:t>170.8</w:t>
             </w:r>
           </w:p>
         </w:tc>
@@ -9502,7 +9502,7 @@
               <w:rPr>
                 <w:sz w:val="18"/>
               </w:rPr>
-              <w:t>0.999</w:t>
+              <w:t>0.965</w:t>
             </w:r>
           </w:p>
         </w:tc>
@@ -9518,7 +9518,7 @@
         <w:jc w:val="both"/>
       </w:pPr>
       <w:r>
-        <w:t>A single TA becomes the bottleneck as soon as the offered load exceeds its service capacity. Its queue fills, requests wait past their timeouts or are refused, and success falls to 40.5 % at 3000 requests/s. Adding RTAs without load balancing helps, but only partly. The hot-spot RTA still receives 70 % of the traffic while the others sit partly idle, which shows up as a Jain fairness index of 0.853 and 74.5 % success. With the load balancer, requests spill over to the less loaded RTAs once the hot-spot queue grows. With three RTAs the federation authenticated 100.0 % at 3000 requests/s, and two balanced RTAs reached 89.2 %. Delegated credentials make this spill-over possible: the receiving RTA fetches the foreign record once and caches it, so the radio exchange stays unchanged.</w:t>
+        <w:t>A single TA becomes the bottleneck as soon as the offered load exceeds its service capacity. Its queue fills, requests wait past their timeouts or are refused, and success falls to 30.0 % at 3000 requests/s. Adding RTAs without load balancing helps, but only partly. The hot-spot RTA still receives 70 % of the traffic while the others sit partly idle, which shows up as a Jain fairness index of 0.763 and 82.7 % success. With the load balancer, requests spill over to the less loaded RTAs once the hot-spot queue grows. With three RTAs the federation authenticated 100.0 % at 3000 requests/s, and two balanced RTAs reached 99.5 %. Delegated credentials make this spill-over possible: the receiving RTA fetches the foreign record once and caches it, so the radio exchange stays unchanged.</w:t>
       </w:r>
     </w:p>
     <w:p>
@@ -9845,7 +9845,7 @@
               <w:rPr>
                 <w:sz w:val="18"/>
               </w:rPr>
-              <w:t>2,313</w:t>
+              <w:t>2,311</w:t>
             </w:r>
           </w:p>
         </w:tc>
@@ -9862,7 +9862,7 @@
               <w:rPr>
                 <w:sz w:val="18"/>
               </w:rPr>
-              <w:t>3,075</w:t>
+              <w:t>3,057</w:t>
             </w:r>
           </w:p>
         </w:tc>
@@ -9932,7 +9932,7 @@
               <w:rPr>
                 <w:sz w:val="18"/>
               </w:rPr>
-              <w:t>605</w:t>
+              <w:t>604</w:t>
             </w:r>
           </w:p>
         </w:tc>
@@ -9949,7 +9949,7 @@
               <w:rPr>
                 <w:sz w:val="18"/>
               </w:rPr>
-              <w:t>3,057</w:t>
+              <w:t>3,056</w:t>
             </w:r>
           </w:p>
         </w:tc>
@@ -10019,7 +10019,7 @@
               <w:rPr>
                 <w:sz w:val="18"/>
               </w:rPr>
-              <w:t>204</w:t>
+              <w:t>203</w:t>
             </w:r>
           </w:p>
         </w:tc>
@@ -10402,7 +10402,7 @@
               <w:rPr>
                 <w:sz w:val="18"/>
               </w:rPr>
-              <w:t>99.66</w:t>
+              <w:t>99.70</w:t>
             </w:r>
           </w:p>
         </w:tc>
@@ -10419,7 +10419,7 @@
               <w:rPr>
                 <w:sz w:val="18"/>
               </w:rPr>
-              <w:t>86.74</w:t>
+              <w:t>86.40</w:t>
             </w:r>
           </w:p>
         </w:tc>
@@ -10436,7 +10436,7 @@
               <w:rPr>
                 <w:sz w:val="18"/>
               </w:rPr>
-              <w:t>310</w:t>
+              <w:t>311</w:t>
             </w:r>
           </w:p>
         </w:tc>
@@ -10523,7 +10523,7 @@
               <w:rPr>
                 <w:sz w:val="18"/>
               </w:rPr>
-              <w:t>99.82</w:t>
+              <w:t>99.78</w:t>
             </w:r>
           </w:p>
         </w:tc>
@@ -10540,7 +10540,7 @@
               <w:rPr>
                 <w:sz w:val="18"/>
               </w:rPr>
-              <w:t>86.91</w:t>
+              <w:t>86.90</w:t>
             </w:r>
           </w:p>
         </w:tc>
@@ -10644,7 +10644,7 @@
               <w:rPr>
                 <w:sz w:val="18"/>
               </w:rPr>
-              <w:t>91.85</w:t>
+              <w:t>91.76</w:t>
             </w:r>
           </w:p>
         </w:tc>
@@ -10661,7 +10661,7 @@
               <w:rPr>
                 <w:sz w:val="18"/>
               </w:rPr>
-              <w:t>85.22</w:t>
+              <w:t>85.06</w:t>
             </w:r>
           </w:p>
         </w:tc>
@@ -10678,7 +10678,7 @@
               <w:rPr>
                 <w:sz w:val="18"/>
               </w:rPr>
-              <w:t>177</w:t>
+              <w:t>179</w:t>
             </w:r>
           </w:p>
         </w:tc>
@@ -10695,7 +10695,7 @@
               <w:rPr>
                 <w:sz w:val="18"/>
               </w:rPr>
-              <w:t>69</w:t>
+              <w:t>70</w:t>
             </w:r>
           </w:p>
         </w:tc>
@@ -10712,7 +10712,7 @@
               <w:rPr>
                 <w:sz w:val="18"/>
               </w:rPr>
-              <w:t>758</w:t>
+              <w:t>763</w:t>
             </w:r>
           </w:p>
         </w:tc>
@@ -10728,7 +10728,7 @@
         <w:jc w:val="both"/>
       </w:pPr>
       <w:r>
-        <w:t>Higher speed means more frequent cell changes (more authentications per second) and, in our stress model, more packet loss: 6.1 % per vehicle hop at 140 km/h. Retries keep the success rate of both SELAP and HF-SELAP at or above 99.6 %, and the extra latency comes from the 1.5 s timeouts after lost messages. Because evacuating vehicles come from everywhere, 71 % of HF-SELAP authentications were served through delegation, which shows the federation working in practice. The ablation is the most telling result. When the dual ⟨TID</w:t>
+        <w:t>Higher speed means more frequent cell changes (more authentications per second) and, in our stress model, more packet loss: 6.1 % per vehicle hop at 140 km/h. Retries keep the success rate of both SELAP and HF-SELAP at or above 99.7 %, and the extra latency comes from the 1.5 s timeouts after lost messages. Because evacuating vehicles come from everywhere, 71 % of HF-SELAP authentications were served through delegation, which shows the federation working in practice. The ablation is the most telling result. When the dual ⟨TID</w:t>
       </w:r>
       <w:r>
         <w:rPr>
@@ -10746,7 +10746,7 @@
         <w:t>c</w:t>
       </w:r>
       <w:r>
-        <w:t>⟩ record is removed, every lost Msg4 strands a vehicle on an identity the TA no longer accepts: 758 lock-outs occurred at 140 km/h, and success fell to 91.9 %. With the dual record there were none. The ablation's lower mean latency in Fig. 10 is a selection effect, not a benefit: its requests that hit a lost Msg4 end in failure instead of in a slow but successful retry, so they drop out of the latency average.</w:t>
+        <w:t>⟩ record is removed, every lost Msg4 strands a vehicle on an identity the TA no longer accepts: 763 lock-outs occurred at 140 km/h, and success fell to 91.8 %. With the dual record there were none. The ablation's lower mean latency in Fig. 10 is a selection effect, not a benefit: its requests that hit a lost Msg4 end in failure instead of in a slow but successful retry, so they drop out of the latency average.</w:t>
       </w:r>
     </w:p>
     <w:p>
@@ -10812,7 +10812,7 @@
         <w:rPr>
           <w:sz w:val="19"/>
         </w:rPr>
-        <w:t xml:space="preserve"> Key-reproduction failure per PUF read versus bit-error rate for repetition factors 3–9 (2000 trials per point).</w:t>
+        <w:t xml:space="preserve"> Key-reproduction failure per PUF read versus bit-error rate for repetition factors 3–9 (400 trials per point).</w:t>
       </w:r>
     </w:p>
     <w:p>
@@ -11175,7 +11175,7 @@
         <w:jc w:val="both"/>
       </w:pPr>
       <w:r>
-        <w:t>The responses are well separated. Re-reads of one chip differ in 3.0 % of bits on average, different chips in 49.9 %, and the bit uniformity is 50.0 %. A clone therefore misses the key by a wide margin, while the genuine UAV stays well inside the correction radius. At the default 3 % noise, a single read with repetition 7 failed in 0.70 % of trials. Allowing up to three reads lowers end-to-end failure from 21.00 % to 0.33 % even at 9 % noise. Shorter codes are inadequate: at 4 % noise one read fails in 45.7 % of trials with repetition 3 and 7.4 % with repetition 5, against 1.1 % with repetition 7, which is why 7 is the default. Repetition 9 is more robust still, but makes the helper data proportionally larger.</w:t>
+        <w:t>The responses are well separated. Re-reads of one chip differ in 3.0 % of bits on average, different chips in 50.0 %, and the bit uniformity is 50.0 %. A clone therefore misses the key by a wide margin, while the genuine UAV stays well inside the correction radius. At the default 3 % noise, a single read with repetition 7 failed in 0.00 % of trials. Allowing up to three reads lowers end-to-end failure from 21.00 % to 0.33 % even at 9 % noise. Shorter codes are inadequate: at 4 % noise one read fails in 43.2 % of trials with repetition 3 and 7.8 % with repetition 5, against 0.8 % with repetition 7, which is why 7 is the default. Repetition 9 is more robust still, but makes the helper data proportionally larger.</w:t>
       </w:r>
     </w:p>
     <w:p>
@@ -11352,7 +11352,7 @@
               <w:rPr>
                 <w:sz w:val="18"/>
               </w:rPr>
-              <w:t>0.52 / 1560</w:t>
+              <w:t>0.75 / 1560</w:t>
             </w:r>
           </w:p>
         </w:tc>
@@ -11369,7 +11369,7 @@
               <w:rPr>
                 <w:sz w:val="18"/>
               </w:rPr>
-              <w:t>0.65 / 1176</w:t>
+              <w:t>0.96 / 1176</w:t>
             </w:r>
           </w:p>
         </w:tc>
@@ -11386,7 +11386,7 @@
               <w:rPr>
                 <w:sz w:val="18"/>
               </w:rPr>
-              <w:t>72 / 117,600</w:t>
+              <w:t>85 / 117,600</w:t>
             </w:r>
           </w:p>
         </w:tc>
@@ -11422,7 +11422,7 @@
               <w:rPr>
                 <w:sz w:val="18"/>
               </w:rPr>
-              <w:t>500</w:t>
+              <w:t>300</w:t>
             </w:r>
           </w:p>
         </w:tc>
@@ -11439,7 +11439,7 @@
               <w:rPr>
                 <w:sz w:val="18"/>
               </w:rPr>
-              <w:t>0.67 / 1560</w:t>
+              <w:t>0.85 / 1560</w:t>
             </w:r>
           </w:p>
         </w:tc>
@@ -11456,7 +11456,7 @@
               <w:rPr>
                 <w:sz w:val="18"/>
               </w:rPr>
-              <w:t>0.81 / 1176</w:t>
+              <w:t>1.69 / 1176</w:t>
             </w:r>
           </w:p>
         </w:tc>
@@ -11473,181 +11473,7 @@
               <w:rPr>
                 <w:sz w:val="18"/>
               </w:rPr>
-              <w:t>358 / 588,000</w:t>
-            </w:r>
-          </w:p>
-        </w:tc>
-        <w:tc>
-          <w:tcPr>
-            <w:tcW w:type="dxa" w:w="1474"/>
-          </w:tcPr>
-          <w:p>
-            <w:pPr>
-              <w:spacing w:after="0" w:line="240" w:lineRule="auto"/>
-              <w:jc w:val="center"/>
-            </w:pPr>
-            <w:r>
-              <w:rPr>
-                <w:sz w:val="18"/>
-              </w:rPr>
-              <w:t>yes</w:t>
-            </w:r>
-          </w:p>
-        </w:tc>
-      </w:tr>
-      <w:tr>
-        <w:tc>
-          <w:tcPr>
-            <w:tcW w:type="dxa" w:w="1587"/>
-          </w:tcPr>
-          <w:p>
-            <w:pPr>
-              <w:spacing w:after="0" w:line="240" w:lineRule="auto"/>
-              <w:jc w:val="left"/>
-            </w:pPr>
-            <w:r>
-              <w:rPr>
-                <w:sz w:val="18"/>
-              </w:rPr>
-              <w:t>1000</w:t>
-            </w:r>
-          </w:p>
-        </w:tc>
-        <w:tc>
-          <w:tcPr>
-            <w:tcW w:type="dxa" w:w="1814"/>
-          </w:tcPr>
-          <w:p>
-            <w:pPr>
-              <w:spacing w:after="0" w:line="240" w:lineRule="auto"/>
-              <w:jc w:val="center"/>
-            </w:pPr>
-            <w:r>
-              <w:rPr>
-                <w:sz w:val="18"/>
-              </w:rPr>
-              <w:t>0.58 / 1560</w:t>
-            </w:r>
-          </w:p>
-        </w:tc>
-        <w:tc>
-          <w:tcPr>
-            <w:tcW w:type="dxa" w:w="1814"/>
-          </w:tcPr>
-          <w:p>
-            <w:pPr>
-              <w:spacing w:after="0" w:line="240" w:lineRule="auto"/>
-              <w:jc w:val="center"/>
-            </w:pPr>
-            <w:r>
-              <w:rPr>
-                <w:sz w:val="18"/>
-              </w:rPr>
-              <w:t>0.76 / 1176</w:t>
-            </w:r>
-          </w:p>
-        </w:tc>
-        <w:tc>
-          <w:tcPr>
-            <w:tcW w:type="dxa" w:w="2041"/>
-          </w:tcPr>
-          <w:p>
-            <w:pPr>
-              <w:spacing w:after="0" w:line="240" w:lineRule="auto"/>
-              <w:jc w:val="center"/>
-            </w:pPr>
-            <w:r>
-              <w:rPr>
-                <w:sz w:val="18"/>
-              </w:rPr>
-              <w:t>725 / 1,176,000</w:t>
-            </w:r>
-          </w:p>
-        </w:tc>
-        <w:tc>
-          <w:tcPr>
-            <w:tcW w:type="dxa" w:w="1474"/>
-          </w:tcPr>
-          <w:p>
-            <w:pPr>
-              <w:spacing w:after="0" w:line="240" w:lineRule="auto"/>
-              <w:jc w:val="center"/>
-            </w:pPr>
-            <w:r>
-              <w:rPr>
-                <w:sz w:val="18"/>
-              </w:rPr>
-              <w:t>yes</w:t>
-            </w:r>
-          </w:p>
-        </w:tc>
-      </w:tr>
-      <w:tr>
-        <w:tc>
-          <w:tcPr>
-            <w:tcW w:type="dxa" w:w="1587"/>
-          </w:tcPr>
-          <w:p>
-            <w:pPr>
-              <w:spacing w:after="0" w:line="240" w:lineRule="auto"/>
-              <w:jc w:val="left"/>
-            </w:pPr>
-            <w:r>
-              <w:rPr>
-                <w:sz w:val="18"/>
-              </w:rPr>
-              <w:t>2000</w:t>
-            </w:r>
-          </w:p>
-        </w:tc>
-        <w:tc>
-          <w:tcPr>
-            <w:tcW w:type="dxa" w:w="1814"/>
-          </w:tcPr>
-          <w:p>
-            <w:pPr>
-              <w:spacing w:after="0" w:line="240" w:lineRule="auto"/>
-              <w:jc w:val="center"/>
-            </w:pPr>
-            <w:r>
-              <w:rPr>
-                <w:sz w:val="18"/>
-              </w:rPr>
-              <w:t>0.60 / 1560</w:t>
-            </w:r>
-          </w:p>
-        </w:tc>
-        <w:tc>
-          <w:tcPr>
-            <w:tcW w:type="dxa" w:w="1814"/>
-          </w:tcPr>
-          <w:p>
-            <w:pPr>
-              <w:spacing w:after="0" w:line="240" w:lineRule="auto"/>
-              <w:jc w:val="center"/>
-            </w:pPr>
-            <w:r>
-              <w:rPr>
-                <w:sz w:val="18"/>
-              </w:rPr>
-              <w:t>0.78 / 1176</w:t>
-            </w:r>
-          </w:p>
-        </w:tc>
-        <w:tc>
-          <w:tcPr>
-            <w:tcW w:type="dxa" w:w="2041"/>
-          </w:tcPr>
-          <w:p>
-            <w:pPr>
-              <w:spacing w:after="0" w:line="240" w:lineRule="auto"/>
-              <w:jc w:val="center"/>
-            </w:pPr>
-            <w:r>
-              <w:rPr>
-                <w:sz w:val="18"/>
-              </w:rPr>
-              <w:t>1,481 / 2,352,000</w:t>
+              <w:t>314 / 352,800</w:t>
             </w:r>
           </w:p>
         </w:tc>
@@ -11680,7 +11506,7 @@
         <w:jc w:val="both"/>
       </w:pPr>
       <w:r>
-        <w:t>Revocation and recovery costs do not depend on the network size. Revoking an entity is one message per RTA, and recovering it is one enrolment. Without a recovery protocol, replacing compromised credentials safely would mean re-enrolling all 2000 vehicles: 1,481 ms of computation and 2,352,000 bits at enrolment alone, before counting the physical re-issue of smart cards. In every run, the revoked entity was rejected by every RTA, including RTAs that had cached its credentials earlier, and the re-enrolled entity authenticated successfully.</w:t>
+        <w:t>Revocation and recovery costs do not depend on the network size. Revoking an entity is one message per RTA, and recovering it is one enrolment. Without a recovery protocol, replacing compromised credentials safely would mean re-enrolling all 300 vehicles: 314 ms of computation and 352,800 bits at enrolment alone, before counting the physical re-issue of smart cards. In every run, the revoked entity was rejected by every RTA, including RTAs that had cached its credentials earlier, and the re-enrolled entity authenticated successfully.</w:t>
       </w:r>
     </w:p>
     <w:p>
@@ -14116,7 +13942,7 @@
         <w:t>Post-quantum considerations.</w:t>
       </w:r>
       <w:r>
-        <w:t xml:space="preserve"> SELAP and HF-SELAP use no public-key cryptography, so Shor's algorithm, which breaks RSA and elliptic-curve schemes, does not apply. The remaining quantum threat is Grover's search, which roughly halves the effective length of symmetric keys. Ascon-128 offers about 64-bit security against quantum key search, and the Ascon-80pq mode raises this to about 80 bits. SHA-256 keeps roughly 128-bit preimage resistance. The migration changed neither message sizes nor storage and moved total computation by 1.9 %. A complete post-quantum design would also need quantum-safe enrolment if public-key bootstrapping were ever introduced (for example ML-KEM); the present symmetric design avoids that need.</w:t>
+        <w:t xml:space="preserve"> SELAP and HF-SELAP use no public-key cryptography, so Shor's algorithm, which breaks RSA and elliptic-curve schemes, does not apply. The remaining quantum threat is Grover's search, which roughly halves the effective length of symmetric keys. Ascon-128 offers about 64-bit security against quantum key search, and the Ascon-80pq mode raises this to about 80 bits. SHA-256 keeps roughly 128-bit preimage resistance. The migration changed neither message sizes nor storage and moved total computation by -0.1 %. A complete post-quantum design would also need quantum-safe enrolment if public-key bootstrapping were ever introduced (for example ML-KEM); the present symmetric design avoids that need.</w:t>
       </w:r>
     </w:p>
     <w:p>
@@ -14148,7 +13974,7 @@
         <w:jc w:val="both"/>
       </w:pPr>
       <w:r>
-        <w:t>This project designed, implemented and evaluated HF-SELAP, which extends the lightweight SELAP authentication protocol for UAV-assisted VANETs from a single trusted authority to a hierarchical federation of Regional TAs under a Root TA. The SELAP exchange is preserved exactly: four ASCON-protected messages totalling 2432 bits, the same operation counts on vehicles and UAVs, and PUF-based UAV identity. Around it, HF-SELAP adds delegated cross-region authentication, load balancing, heartbeat fail-over with resynchronisation, a federated revocation registry, recovery by re-enrolment and an Ascon-80pq post-quantum mode. In the measurements, the vehicle needed 0.383 ms and the UAV 1.165 ms of computation per authentication. Three balanced RTAs sustained 100.0 % success at 3000 requests/s where a single TA managed 40.5 %. During a TA outage, 91.4 % of requests were still served within one second. All 22 attack scenarios were blocked. Future work includes a native and hardware-accelerated implementation on embedded UAV platforms, field trials with real 5G/C-V2X radios and hardware PUFs, threshold or multi-party techniques so that no single TA can derive session keys, a compact fuzzy extractor based on BCH or polar codes, and formal verification of the federation messages with tools such as ProVerif.</w:t>
+        <w:t>This project designed, implemented and evaluated HF-SELAP, which extends the lightweight SELAP authentication protocol for UAV-assisted VANETs from a single trusted authority to a hierarchical federation of Regional TAs under a Root TA. The SELAP exchange is preserved exactly: four ASCON-protected messages totalling 2432 bits, the same operation counts on vehicles and UAVs, and PUF-based UAV identity. Around it, HF-SELAP adds delegated cross-region authentication, load balancing, heartbeat fail-over with resynchronisation, a federated revocation registry, recovery by re-enrolment and an Ascon-80pq post-quantum mode. In the measurements, the vehicle needed 0.326 ms and the UAV 0.680 ms of computation per authentication. Three balanced RTAs sustained 100.0 % success at 3000 requests/s where a single TA managed 30.0 %. During a TA outage, 91.4 % of requests were still served within one second. All 22 attack scenarios were blocked. Future work includes a native and hardware-accelerated implementation on embedded UAV platforms, field trials with real 5G/C-V2X radios and hardware PUFs, threshold or multi-party techniques so that no single TA can derive session keys, a compact fuzzy extractor based on BCH or polar codes, and formal verification of the federation messages with tools such as ProVerif.</w:t>
       </w:r>
     </w:p>
     <w:p>

</xml_diff>